<commit_message>
v1.1.1: Implemented Choices.js globally, added real-time active validations on assessment inputs, and eliminated monolithic obsolete code
</commit_message>
<xml_diff>
--- a/rsp-dashboard/public/templates/Notice to DQ - Higher Teaching.docx
+++ b/rsp-dashboard/public/templates/Notice to DQ - Higher Teaching.docx
@@ -23,7 +23,21 @@
         <w:rPr>
           <w:rFonts w:ascii="Bookman Old Style" w:hAnsi="Bookman Old Style"/>
         </w:rPr>
-        <w:t>{FormattedDate}</w:t>
+        <w:t>{</w:t>
+      </w:r>
+      <w:proofErr w:type="spellStart"/>
+      <w:r>
+        <w:rPr>
+          <w:rFonts w:ascii="Bookman Old Style" w:hAnsi="Bookman Old Style"/>
+        </w:rPr>
+        <w:t>FormattedDate</w:t>
+      </w:r>
+      <w:proofErr w:type="spellEnd"/>
+      <w:r>
+        <w:rPr>
+          <w:rFonts w:ascii="Bookman Old Style" w:hAnsi="Bookman Old Style"/>
+        </w:rPr>
+        <w:t>}</w:t>
       </w:r>
     </w:p>
     <w:p>
@@ -49,7 +63,25 @@
           <w:b/>
           <w:bCs/>
         </w:rPr>
-        <w:t>{ApplicantName}</w:t>
+        <w:t>{</w:t>
+      </w:r>
+      <w:proofErr w:type="spellStart"/>
+      <w:r>
+        <w:rPr>
+          <w:rFonts w:ascii="Bookman Old Style" w:hAnsi="Bookman Old Style"/>
+          <w:b/>
+          <w:bCs/>
+        </w:rPr>
+        <w:t>ApplicantName</w:t>
+      </w:r>
+      <w:proofErr w:type="spellEnd"/>
+      <w:r>
+        <w:rPr>
+          <w:rFonts w:ascii="Bookman Old Style" w:hAnsi="Bookman Old Style"/>
+          <w:b/>
+          <w:bCs/>
+        </w:rPr>
+        <w:t>}</w:t>
       </w:r>
     </w:p>
     <w:p>
@@ -203,15 +235,15 @@
         <w:tblLook w:val="04A0" w:firstRow="1" w:lastRow="0" w:firstColumn="1" w:lastColumn="0" w:noHBand="0" w:noVBand="1"/>
       </w:tblPr>
       <w:tblGrid>
-        <w:gridCol w:w="1885"/>
-        <w:gridCol w:w="3600"/>
-        <w:gridCol w:w="3515"/>
-        <w:gridCol w:w="1440"/>
+        <w:gridCol w:w="1811"/>
+        <w:gridCol w:w="3904"/>
+        <w:gridCol w:w="2836"/>
+        <w:gridCol w:w="1889"/>
       </w:tblGrid>
       <w:tr>
         <w:tc>
           <w:tcPr>
-            <w:tcW w:w="1885" w:type="dxa"/>
+            <w:tcW w:w="1811" w:type="dxa"/>
             <w:tcBorders>
               <w:top w:val="single" w:sz="4" w:space="0" w:color="auto"/>
               <w:left w:val="single" w:sz="4" w:space="0" w:color="auto"/>
@@ -242,7 +274,7 @@
         </w:tc>
         <w:tc>
           <w:tcPr>
-            <w:tcW w:w="3600" w:type="dxa"/>
+            <w:tcW w:w="3904" w:type="dxa"/>
             <w:tcBorders>
               <w:top w:val="single" w:sz="4" w:space="0" w:color="auto"/>
               <w:left w:val="single" w:sz="4" w:space="0" w:color="auto"/>
@@ -273,7 +305,7 @@
         </w:tc>
         <w:tc>
           <w:tcPr>
-            <w:tcW w:w="3515" w:type="dxa"/>
+            <w:tcW w:w="2836" w:type="dxa"/>
             <w:tcBorders>
               <w:top w:val="single" w:sz="4" w:space="0" w:color="auto"/>
               <w:left w:val="single" w:sz="4" w:space="0" w:color="auto"/>
@@ -304,7 +336,7 @@
         </w:tc>
         <w:tc>
           <w:tcPr>
-            <w:tcW w:w="1440" w:type="dxa"/>
+            <w:tcW w:w="1889" w:type="dxa"/>
             <w:tcBorders>
               <w:top w:val="single" w:sz="4" w:space="0" w:color="auto"/>
               <w:left w:val="single" w:sz="4" w:space="0" w:color="auto"/>
@@ -337,7 +369,7 @@
       <w:tr>
         <w:tc>
           <w:tcPr>
-            <w:tcW w:w="1885" w:type="dxa"/>
+            <w:tcW w:w="1811" w:type="dxa"/>
             <w:vMerge w:val="restart"/>
             <w:tcBorders>
               <w:top w:val="single" w:sz="4" w:space="0" w:color="auto"/>
@@ -357,6 +389,9 @@
             <w:r>
               <w:rPr>
                 <w:rFonts w:ascii="Bookman Old Style" w:hAnsi="Bookman Old Style"/>
+                <w:kern w:val="2"/>
+                <w:lang w:val="en-US"/>
+                <w14:ligatures w14:val="standardContextual"/>
               </w:rPr>
               <w:t>{Position}</w:t>
             </w:r>
@@ -364,7 +399,7 @@
         </w:tc>
         <w:tc>
           <w:tcPr>
-            <w:tcW w:w="3600" w:type="dxa"/>
+            <w:tcW w:w="3904" w:type="dxa"/>
             <w:tcBorders>
               <w:top w:val="single" w:sz="4" w:space="0" w:color="auto"/>
               <w:left w:val="single" w:sz="4" w:space="0" w:color="auto"/>
@@ -386,14 +421,17 @@
                 <w:rFonts w:ascii="Bookman Old Style" w:hAnsi="Bookman Old Style"/>
                 <w:b/>
                 <w:kern w:val="2"/>
+                <w:lang w:val="en-US"/>
                 <w14:ligatures w14:val="standardContextual"/>
               </w:rPr>
               <w:t>Education:</w:t>
             </w:r>
-            <w:r>
-              <w:rPr>
-                <w:rFonts w:ascii="Bookman Old Style" w:hAnsi="Bookman Old Style"/>
-                <w:kern w:val="2"/>
+            <w:proofErr w:type="gramStart"/>
+            <w:r>
+              <w:rPr>
+                <w:rFonts w:ascii="Bookman Old Style" w:hAnsi="Bookman Old Style"/>
+                <w:kern w:val="2"/>
+                <w:lang w:val="en-US"/>
                 <w14:ligatures w14:val="standardContextual"/>
               </w:rPr>
               <w:t xml:space="preserve"> </w:t>
@@ -403,6 +441,7 @@
                 <w:rFonts w:ascii="Bookman Old Style" w:hAnsi="Bookman Old Style"/>
                 <w:bCs/>
                 <w:kern w:val="2"/>
+                <w:lang w:val="en-US"/>
                 <w14:ligatures w14:val="standardContextual"/>
               </w:rPr>
               <w:t xml:space="preserve"> </w:t>
@@ -411,6 +450,7 @@
               <w:rPr>
                 <w:rFonts w:ascii="Bookman Old Style" w:hAnsi="Bookman Old Style"/>
                 <w:kern w:val="2"/>
+                <w:lang w:val="en-US"/>
                 <w14:ligatures w14:val="standardContextual"/>
               </w:rPr>
               <w:t xml:space="preserve"> </w:t>
@@ -421,15 +461,41 @@
                 <w:bCs/>
                 <w:color w:val="EE0000"/>
                 <w:kern w:val="2"/>
-                <w14:ligatures w14:val="standardContextual"/>
-              </w:rPr>
-              <w:t>{QSEducation}</w:t>
+                <w:lang w:val="en-US"/>
+                <w14:ligatures w14:val="standardContextual"/>
+              </w:rPr>
+              <w:t>{</w:t>
+            </w:r>
+            <w:proofErr w:type="spellStart"/>
+            <w:proofErr w:type="gramEnd"/>
+            <w:r>
+              <w:rPr>
+                <w:rFonts w:ascii="Bookman Old Style" w:hAnsi="Bookman Old Style"/>
+                <w:bCs/>
+                <w:color w:val="EE0000"/>
+                <w:kern w:val="2"/>
+                <w:lang w:val="en-US"/>
+                <w14:ligatures w14:val="standardContextual"/>
+              </w:rPr>
+              <w:t>QSEducation</w:t>
+            </w:r>
+            <w:proofErr w:type="spellEnd"/>
+            <w:r>
+              <w:rPr>
+                <w:rFonts w:ascii="Bookman Old Style" w:hAnsi="Bookman Old Style"/>
+                <w:bCs/>
+                <w:color w:val="EE0000"/>
+                <w:kern w:val="2"/>
+                <w:lang w:val="en-US"/>
+                <w14:ligatures w14:val="standardContextual"/>
+              </w:rPr>
+              <w:t>}</w:t>
             </w:r>
           </w:p>
         </w:tc>
         <w:tc>
           <w:tcPr>
-            <w:tcW w:w="3515" w:type="dxa"/>
+            <w:tcW w:w="2836" w:type="dxa"/>
             <w:tcBorders>
               <w:top w:val="single" w:sz="4" w:space="0" w:color="auto"/>
               <w:left w:val="single" w:sz="4" w:space="0" w:color="auto"/>
@@ -448,14 +514,37 @@
             <w:r>
               <w:rPr>
                 <w:rFonts w:ascii="Bookman Old Style" w:hAnsi="Bookman Old Style"/>
-              </w:rPr>
-              <w:t>{AppEducation}</w:t>
+                <w:kern w:val="2"/>
+                <w:lang w:val="en-US"/>
+                <w14:ligatures w14:val="standardContextual"/>
+              </w:rPr>
+              <w:t>{</w:t>
+            </w:r>
+            <w:proofErr w:type="spellStart"/>
+            <w:r>
+              <w:rPr>
+                <w:rFonts w:ascii="Bookman Old Style" w:hAnsi="Bookman Old Style"/>
+                <w:kern w:val="2"/>
+                <w:lang w:val="en-US"/>
+                <w14:ligatures w14:val="standardContextual"/>
+              </w:rPr>
+              <w:t>AppEducation</w:t>
+            </w:r>
+            <w:proofErr w:type="spellEnd"/>
+            <w:r>
+              <w:rPr>
+                <w:rFonts w:ascii="Bookman Old Style" w:hAnsi="Bookman Old Style"/>
+                <w:kern w:val="2"/>
+                <w:lang w:val="en-US"/>
+                <w14:ligatures w14:val="standardContextual"/>
+              </w:rPr>
+              <w:t>}</w:t>
             </w:r>
           </w:p>
         </w:tc>
         <w:tc>
           <w:tcPr>
-            <w:tcW w:w="1440" w:type="dxa"/>
+            <w:tcW w:w="1889" w:type="dxa"/>
             <w:tcBorders>
               <w:top w:val="single" w:sz="4" w:space="0" w:color="auto"/>
               <w:left w:val="single" w:sz="4" w:space="0" w:color="auto"/>
@@ -475,8 +564,31 @@
             <w:r>
               <w:rPr>
                 <w:rFonts w:ascii="Bookman Old Style" w:hAnsi="Bookman Old Style"/>
-              </w:rPr>
-              <w:t>{RmEducation}</w:t>
+                <w:kern w:val="2"/>
+                <w:lang w:val="en-US"/>
+                <w14:ligatures w14:val="standardContextual"/>
+              </w:rPr>
+              <w:t>{</w:t>
+            </w:r>
+            <w:proofErr w:type="spellStart"/>
+            <w:r>
+              <w:rPr>
+                <w:rFonts w:ascii="Bookman Old Style" w:hAnsi="Bookman Old Style"/>
+                <w:kern w:val="2"/>
+                <w:lang w:val="en-US"/>
+                <w14:ligatures w14:val="standardContextual"/>
+              </w:rPr>
+              <w:t>RmEducation</w:t>
+            </w:r>
+            <w:proofErr w:type="spellEnd"/>
+            <w:r>
+              <w:rPr>
+                <w:rFonts w:ascii="Bookman Old Style" w:hAnsi="Bookman Old Style"/>
+                <w:kern w:val="2"/>
+                <w:lang w:val="en-US"/>
+                <w14:ligatures w14:val="standardContextual"/>
+              </w:rPr>
+              <w:t>}</w:t>
             </w:r>
           </w:p>
         </w:tc>
@@ -484,7 +596,7 @@
       <w:tr>
         <w:tc>
           <w:tcPr>
-            <w:tcW w:w="1885" w:type="dxa"/>
+            <w:tcW w:w="1811" w:type="dxa"/>
             <w:vMerge/>
             <w:tcBorders>
               <w:left w:val="single" w:sz="4" w:space="0" w:color="auto"/>
@@ -504,7 +616,7 @@
         </w:tc>
         <w:tc>
           <w:tcPr>
-            <w:tcW w:w="3600" w:type="dxa"/>
+            <w:tcW w:w="3904" w:type="dxa"/>
             <w:tcBorders>
               <w:top w:val="single" w:sz="4" w:space="0" w:color="auto"/>
               <w:left w:val="single" w:sz="4" w:space="0" w:color="auto"/>
@@ -526,14 +638,27 @@
                 <w:rFonts w:ascii="Bookman Old Style" w:hAnsi="Bookman Old Style"/>
                 <w:b/>
                 <w:kern w:val="2"/>
-                <w14:ligatures w14:val="standardContextual"/>
-              </w:rPr>
-              <w:t xml:space="preserve">Experience: </w:t>
-            </w:r>
-            <w:r>
-              <w:rPr>
-                <w:rFonts w:ascii="Bookman Old Style" w:hAnsi="Bookman Old Style"/>
-                <w:kern w:val="2"/>
+                <w:lang w:val="en-US"/>
+                <w14:ligatures w14:val="standardContextual"/>
+              </w:rPr>
+              <w:t>Training</w:t>
+            </w:r>
+            <w:proofErr w:type="gramStart"/>
+            <w:r>
+              <w:rPr>
+                <w:rFonts w:ascii="Bookman Old Style" w:hAnsi="Bookman Old Style"/>
+                <w:b/>
+                <w:kern w:val="2"/>
+                <w:lang w:val="en-US"/>
+                <w14:ligatures w14:val="standardContextual"/>
+              </w:rPr>
+              <w:t xml:space="preserve">: </w:t>
+            </w:r>
+            <w:r>
+              <w:rPr>
+                <w:rFonts w:ascii="Bookman Old Style" w:hAnsi="Bookman Old Style"/>
+                <w:kern w:val="2"/>
+                <w:lang w:val="en-US"/>
                 <w14:ligatures w14:val="standardContextual"/>
               </w:rPr>
               <w:t xml:space="preserve"> </w:t>
@@ -544,25 +669,41 @@
                 <w:bCs/>
                 <w:color w:val="EE0000"/>
                 <w:kern w:val="2"/>
-                <w14:ligatures w14:val="standardContextual"/>
-              </w:rPr>
-              <w:t xml:space="preserve">4 </w:t>
-            </w:r>
+                <w:lang w:val="en-US"/>
+                <w14:ligatures w14:val="standardContextual"/>
+              </w:rPr>
+              <w:t>{</w:t>
+            </w:r>
+            <w:proofErr w:type="spellStart"/>
+            <w:proofErr w:type="gramEnd"/>
             <w:r>
               <w:rPr>
                 <w:rFonts w:ascii="Bookman Old Style" w:hAnsi="Bookman Old Style"/>
                 <w:bCs/>
                 <w:color w:val="EE0000"/>
                 <w:kern w:val="2"/>
-                <w14:ligatures w14:val="standardContextual"/>
-              </w:rPr>
-              <w:t>years of relevant teaching/ industry work experience</w:t>
+                <w:lang w:val="en-US"/>
+                <w14:ligatures w14:val="standardContextual"/>
+              </w:rPr>
+              <w:t>QSTraining</w:t>
+            </w:r>
+            <w:proofErr w:type="spellEnd"/>
+            <w:r>
+              <w:rPr>
+                <w:rFonts w:ascii="Bookman Old Style" w:hAnsi="Bookman Old Style"/>
+                <w:bCs/>
+                <w:color w:val="EE0000"/>
+                <w:kern w:val="2"/>
+                <w:lang w:val="en-US"/>
+                <w14:ligatures w14:val="standardContextual"/>
+              </w:rPr>
+              <w:t>}</w:t>
             </w:r>
           </w:p>
         </w:tc>
         <w:tc>
           <w:tcPr>
-            <w:tcW w:w="3515" w:type="dxa"/>
+            <w:tcW w:w="2836" w:type="dxa"/>
             <w:tcBorders>
               <w:top w:val="single" w:sz="4" w:space="0" w:color="auto"/>
               <w:left w:val="single" w:sz="4" w:space="0" w:color="auto"/>
@@ -581,20 +722,37 @@
             <w:r>
               <w:rPr>
                 <w:rFonts w:ascii="Bookman Old Style" w:hAnsi="Bookman Old Style"/>
-              </w:rPr>
-              <w:t>Cash Management and Control System</w:t>
-            </w:r>
-            <w:r>
-              <w:rPr>
-                <w:rFonts w:ascii="Bookman Old Style" w:hAnsi="Bookman Old Style"/>
-              </w:rPr>
-              <w:t xml:space="preserve"> (24 month)</w:t>
+                <w:kern w:val="2"/>
+                <w:lang w:val="en-US"/>
+                <w14:ligatures w14:val="standardContextual"/>
+              </w:rPr>
+              <w:t>{</w:t>
+            </w:r>
+            <w:proofErr w:type="spellStart"/>
+            <w:r>
+              <w:rPr>
+                <w:rFonts w:ascii="Bookman Old Style" w:hAnsi="Bookman Old Style"/>
+                <w:kern w:val="2"/>
+                <w:lang w:val="en-US"/>
+                <w14:ligatures w14:val="standardContextual"/>
+              </w:rPr>
+              <w:t>AppTraining</w:t>
+            </w:r>
+            <w:proofErr w:type="spellEnd"/>
+            <w:r>
+              <w:rPr>
+                <w:rFonts w:ascii="Bookman Old Style" w:hAnsi="Bookman Old Style"/>
+                <w:kern w:val="2"/>
+                <w:lang w:val="en-US"/>
+                <w14:ligatures w14:val="standardContextual"/>
+              </w:rPr>
+              <w:t>}</w:t>
             </w:r>
           </w:p>
         </w:tc>
         <w:tc>
           <w:tcPr>
-            <w:tcW w:w="1440" w:type="dxa"/>
+            <w:tcW w:w="1889" w:type="dxa"/>
             <w:tcBorders>
               <w:top w:val="single" w:sz="4" w:space="0" w:color="auto"/>
               <w:left w:val="single" w:sz="4" w:space="0" w:color="auto"/>
@@ -615,8 +773,31 @@
             <w:r>
               <w:rPr>
                 <w:rFonts w:ascii="Bookman Old Style" w:hAnsi="Bookman Old Style"/>
-              </w:rPr>
-              <w:t>{RmExperience}</w:t>
+                <w:kern w:val="2"/>
+                <w:lang w:val="en-US"/>
+                <w14:ligatures w14:val="standardContextual"/>
+              </w:rPr>
+              <w:t>{</w:t>
+            </w:r>
+            <w:proofErr w:type="spellStart"/>
+            <w:r>
+              <w:rPr>
+                <w:rFonts w:ascii="Bookman Old Style" w:hAnsi="Bookman Old Style"/>
+                <w:kern w:val="2"/>
+                <w:lang w:val="en-US"/>
+                <w14:ligatures w14:val="standardContextual"/>
+              </w:rPr>
+              <w:t>RmExperience</w:t>
+            </w:r>
+            <w:proofErr w:type="spellEnd"/>
+            <w:r>
+              <w:rPr>
+                <w:rFonts w:ascii="Bookman Old Style" w:hAnsi="Bookman Old Style"/>
+                <w:kern w:val="2"/>
+                <w:lang w:val="en-US"/>
+                <w14:ligatures w14:val="standardContextual"/>
+              </w:rPr>
+              <w:t>}</w:t>
             </w:r>
           </w:p>
         </w:tc>
@@ -624,7 +805,7 @@
       <w:tr>
         <w:tc>
           <w:tcPr>
-            <w:tcW w:w="1885" w:type="dxa"/>
+            <w:tcW w:w="1811" w:type="dxa"/>
             <w:vMerge/>
             <w:tcBorders>
               <w:left w:val="single" w:sz="4" w:space="0" w:color="auto"/>
@@ -644,7 +825,7 @@
         </w:tc>
         <w:tc>
           <w:tcPr>
-            <w:tcW w:w="3600" w:type="dxa"/>
+            <w:tcW w:w="3904" w:type="dxa"/>
             <w:tcBorders>
               <w:top w:val="single" w:sz="4" w:space="0" w:color="auto"/>
               <w:left w:val="single" w:sz="4" w:space="0" w:color="auto"/>
@@ -666,14 +847,27 @@
                 <w:rFonts w:ascii="Bookman Old Style" w:hAnsi="Bookman Old Style"/>
                 <w:b/>
                 <w:kern w:val="2"/>
-                <w14:ligatures w14:val="standardContextual"/>
-              </w:rPr>
-              <w:t xml:space="preserve">Training: </w:t>
-            </w:r>
-            <w:r>
-              <w:rPr>
-                <w:rFonts w:ascii="Bookman Old Style" w:hAnsi="Bookman Old Style"/>
-                <w:kern w:val="2"/>
+                <w:lang w:val="en-US"/>
+                <w14:ligatures w14:val="standardContextual"/>
+              </w:rPr>
+              <w:t>Experience</w:t>
+            </w:r>
+            <w:proofErr w:type="gramStart"/>
+            <w:r>
+              <w:rPr>
+                <w:rFonts w:ascii="Bookman Old Style" w:hAnsi="Bookman Old Style"/>
+                <w:b/>
+                <w:kern w:val="2"/>
+                <w:lang w:val="en-US"/>
+                <w14:ligatures w14:val="standardContextual"/>
+              </w:rPr>
+              <w:t xml:space="preserve">: </w:t>
+            </w:r>
+            <w:r>
+              <w:rPr>
+                <w:rFonts w:ascii="Bookman Old Style" w:hAnsi="Bookman Old Style"/>
+                <w:kern w:val="2"/>
+                <w:lang w:val="en-US"/>
                 <w14:ligatures w14:val="standardContextual"/>
               </w:rPr>
               <w:t xml:space="preserve"> </w:t>
@@ -684,15 +878,41 @@
                 <w:bCs/>
                 <w:color w:val="EE0000"/>
                 <w:kern w:val="2"/>
-                <w14:ligatures w14:val="standardContextual"/>
-              </w:rPr>
-              <w:t>{QSTraining}</w:t>
+                <w:lang w:val="en-US"/>
+                <w14:ligatures w14:val="standardContextual"/>
+              </w:rPr>
+              <w:t>{</w:t>
+            </w:r>
+            <w:proofErr w:type="spellStart"/>
+            <w:proofErr w:type="gramEnd"/>
+            <w:r>
+              <w:rPr>
+                <w:rFonts w:ascii="Bookman Old Style" w:hAnsi="Bookman Old Style"/>
+                <w:bCs/>
+                <w:color w:val="EE0000"/>
+                <w:kern w:val="2"/>
+                <w:lang w:val="en-US"/>
+                <w14:ligatures w14:val="standardContextual"/>
+              </w:rPr>
+              <w:t>QSExperience</w:t>
+            </w:r>
+            <w:proofErr w:type="spellEnd"/>
+            <w:r>
+              <w:rPr>
+                <w:rFonts w:ascii="Bookman Old Style" w:hAnsi="Bookman Old Style"/>
+                <w:bCs/>
+                <w:color w:val="EE0000"/>
+                <w:kern w:val="2"/>
+                <w:lang w:val="en-US"/>
+                <w14:ligatures w14:val="standardContextual"/>
+              </w:rPr>
+              <w:t>}</w:t>
             </w:r>
           </w:p>
         </w:tc>
         <w:tc>
           <w:tcPr>
-            <w:tcW w:w="3515" w:type="dxa"/>
+            <w:tcW w:w="2836" w:type="dxa"/>
             <w:tcBorders>
               <w:top w:val="single" w:sz="4" w:space="0" w:color="auto"/>
               <w:left w:val="single" w:sz="4" w:space="0" w:color="auto"/>
@@ -711,62 +931,37 @@
             <w:r>
               <w:rPr>
                 <w:rFonts w:ascii="Bookman Old Style" w:hAnsi="Bookman Old Style"/>
-              </w:rPr>
-              <w:t>Administrative Aide III (Clerk I)</w:t>
-            </w:r>
-            <w:r>
-              <w:rPr>
-                <w:rFonts w:ascii="Bookman Old Style" w:hAnsi="Bookman Old Style"/>
-              </w:rPr>
-              <w:t xml:space="preserve"> - </w:t>
-            </w:r>
-            <w:r>
-              <w:rPr>
-                <w:rFonts w:ascii="Bookman Old Style" w:hAnsi="Bookman Old Style"/>
-              </w:rPr>
-              <w:t>(</w:t>
-            </w:r>
-            <w:r>
-              <w:rPr>
-                <w:rFonts w:ascii="Bookman Old Style" w:hAnsi="Bookman Old Style"/>
-              </w:rPr>
-              <w:t>1</w:t>
-            </w:r>
-            <w:r>
-              <w:rPr>
-                <w:rFonts w:ascii="Bookman Old Style" w:hAnsi="Bookman Old Style"/>
-              </w:rPr>
-              <w:t xml:space="preserve"> yr &amp; </w:t>
-            </w:r>
-            <w:r>
-              <w:rPr>
-                <w:rFonts w:ascii="Bookman Old Style" w:hAnsi="Bookman Old Style"/>
-              </w:rPr>
-              <w:t>7</w:t>
-            </w:r>
-            <w:r>
-              <w:rPr>
-                <w:rFonts w:ascii="Bookman Old Style" w:hAnsi="Bookman Old Style"/>
-              </w:rPr>
-              <w:t xml:space="preserve"> mo</w:t>
-            </w:r>
-            <w:r>
-              <w:rPr>
-                <w:rFonts w:ascii="Bookman Old Style" w:hAnsi="Bookman Old Style"/>
-              </w:rPr>
-              <w:t>s</w:t>
-            </w:r>
-            <w:r>
-              <w:rPr>
-                <w:rFonts w:ascii="Bookman Old Style" w:hAnsi="Bookman Old Style"/>
-              </w:rPr>
-              <w:t>)</w:t>
+                <w:kern w:val="2"/>
+                <w:lang w:val="en-US"/>
+                <w14:ligatures w14:val="standardContextual"/>
+              </w:rPr>
+              <w:t>{</w:t>
+            </w:r>
+            <w:proofErr w:type="spellStart"/>
+            <w:r>
+              <w:rPr>
+                <w:rFonts w:ascii="Bookman Old Style" w:hAnsi="Bookman Old Style"/>
+                <w:kern w:val="2"/>
+                <w:lang w:val="en-US"/>
+                <w14:ligatures w14:val="standardContextual"/>
+              </w:rPr>
+              <w:t>AppExperience</w:t>
+            </w:r>
+            <w:proofErr w:type="spellEnd"/>
+            <w:r>
+              <w:rPr>
+                <w:rFonts w:ascii="Bookman Old Style" w:hAnsi="Bookman Old Style"/>
+                <w:kern w:val="2"/>
+                <w:lang w:val="en-US"/>
+                <w14:ligatures w14:val="standardContextual"/>
+              </w:rPr>
+              <w:t>}</w:t>
             </w:r>
           </w:p>
         </w:tc>
         <w:tc>
           <w:tcPr>
-            <w:tcW w:w="1440" w:type="dxa"/>
+            <w:tcW w:w="1889" w:type="dxa"/>
             <w:tcBorders>
               <w:top w:val="single" w:sz="4" w:space="0" w:color="auto"/>
               <w:left w:val="single" w:sz="4" w:space="0" w:color="auto"/>
@@ -786,8 +981,31 @@
             <w:r>
               <w:rPr>
                 <w:rFonts w:ascii="Bookman Old Style" w:hAnsi="Bookman Old Style"/>
-              </w:rPr>
-              <w:t>{RmTraining}</w:t>
+                <w:kern w:val="2"/>
+                <w:lang w:val="en-US"/>
+                <w14:ligatures w14:val="standardContextual"/>
+              </w:rPr>
+              <w:t>{</w:t>
+            </w:r>
+            <w:proofErr w:type="spellStart"/>
+            <w:r>
+              <w:rPr>
+                <w:rFonts w:ascii="Bookman Old Style" w:hAnsi="Bookman Old Style"/>
+                <w:kern w:val="2"/>
+                <w:lang w:val="en-US"/>
+                <w14:ligatures w14:val="standardContextual"/>
+              </w:rPr>
+              <w:t>RmTraining</w:t>
+            </w:r>
+            <w:proofErr w:type="spellEnd"/>
+            <w:r>
+              <w:rPr>
+                <w:rFonts w:ascii="Bookman Old Style" w:hAnsi="Bookman Old Style"/>
+                <w:kern w:val="2"/>
+                <w:lang w:val="en-US"/>
+                <w14:ligatures w14:val="standardContextual"/>
+              </w:rPr>
+              <w:t>}</w:t>
             </w:r>
           </w:p>
         </w:tc>
@@ -795,7 +1013,7 @@
       <w:tr>
         <w:tc>
           <w:tcPr>
-            <w:tcW w:w="1885" w:type="dxa"/>
+            <w:tcW w:w="1811" w:type="dxa"/>
             <w:vMerge/>
             <w:tcBorders>
               <w:left w:val="single" w:sz="4" w:space="0" w:color="auto"/>
@@ -815,7 +1033,7 @@
         </w:tc>
         <w:tc>
           <w:tcPr>
-            <w:tcW w:w="3600" w:type="dxa"/>
+            <w:tcW w:w="3904" w:type="dxa"/>
             <w:tcBorders>
               <w:top w:val="single" w:sz="4" w:space="0" w:color="auto"/>
               <w:left w:val="single" w:sz="4" w:space="0" w:color="auto"/>
@@ -837,14 +1055,27 @@
                 <w:rFonts w:ascii="Bookman Old Style" w:hAnsi="Bookman Old Style"/>
                 <w:b/>
                 <w:kern w:val="2"/>
-                <w14:ligatures w14:val="standardContextual"/>
-              </w:rPr>
-              <w:t>Eligibility:</w:t>
-            </w:r>
-            <w:r>
-              <w:rPr>
-                <w:rFonts w:ascii="Bookman Old Style" w:hAnsi="Bookman Old Style"/>
-                <w:kern w:val="2"/>
+                <w:lang w:val="en-US"/>
+                <w14:ligatures w14:val="standardContextual"/>
+              </w:rPr>
+              <w:t>Eligibility</w:t>
+            </w:r>
+            <w:proofErr w:type="gramStart"/>
+            <w:r>
+              <w:rPr>
+                <w:rFonts w:ascii="Bookman Old Style" w:hAnsi="Bookman Old Style"/>
+                <w:b/>
+                <w:kern w:val="2"/>
+                <w:lang w:val="en-US"/>
+                <w14:ligatures w14:val="standardContextual"/>
+              </w:rPr>
+              <w:t>:</w:t>
+            </w:r>
+            <w:r>
+              <w:rPr>
+                <w:rFonts w:ascii="Bookman Old Style" w:hAnsi="Bookman Old Style"/>
+                <w:kern w:val="2"/>
+                <w:lang w:val="en-US"/>
                 <w14:ligatures w14:val="standardContextual"/>
               </w:rPr>
               <w:t xml:space="preserve">  </w:t>
@@ -855,15 +1086,41 @@
                 <w:bCs/>
                 <w:color w:val="EE0000"/>
                 <w:kern w:val="2"/>
-                <w14:ligatures w14:val="standardContextual"/>
-              </w:rPr>
-              <w:t>{QSEligibility}</w:t>
+                <w:lang w:val="en-US"/>
+                <w14:ligatures w14:val="standardContextual"/>
+              </w:rPr>
+              <w:t>{</w:t>
+            </w:r>
+            <w:proofErr w:type="spellStart"/>
+            <w:proofErr w:type="gramEnd"/>
+            <w:r>
+              <w:rPr>
+                <w:rFonts w:ascii="Bookman Old Style" w:hAnsi="Bookman Old Style"/>
+                <w:bCs/>
+                <w:color w:val="EE0000"/>
+                <w:kern w:val="2"/>
+                <w:lang w:val="en-US"/>
+                <w14:ligatures w14:val="standardContextual"/>
+              </w:rPr>
+              <w:t>QSEligibility</w:t>
+            </w:r>
+            <w:proofErr w:type="spellEnd"/>
+            <w:r>
+              <w:rPr>
+                <w:rFonts w:ascii="Bookman Old Style" w:hAnsi="Bookman Old Style"/>
+                <w:bCs/>
+                <w:color w:val="EE0000"/>
+                <w:kern w:val="2"/>
+                <w:lang w:val="en-US"/>
+                <w14:ligatures w14:val="standardContextual"/>
+              </w:rPr>
+              <w:t>}</w:t>
             </w:r>
           </w:p>
         </w:tc>
         <w:tc>
           <w:tcPr>
-            <w:tcW w:w="3515" w:type="dxa"/>
+            <w:tcW w:w="2836" w:type="dxa"/>
             <w:tcBorders>
               <w:top w:val="single" w:sz="4" w:space="0" w:color="auto"/>
               <w:left w:val="single" w:sz="4" w:space="0" w:color="auto"/>
@@ -882,14 +1139,37 @@
             <w:r>
               <w:rPr>
                 <w:rFonts w:ascii="Bookman Old Style" w:hAnsi="Bookman Old Style"/>
-              </w:rPr>
-              <w:t>{AppEligibility}</w:t>
+                <w:kern w:val="2"/>
+                <w:lang w:val="en-US"/>
+                <w14:ligatures w14:val="standardContextual"/>
+              </w:rPr>
+              <w:t>{</w:t>
+            </w:r>
+            <w:proofErr w:type="spellStart"/>
+            <w:r>
+              <w:rPr>
+                <w:rFonts w:ascii="Bookman Old Style" w:hAnsi="Bookman Old Style"/>
+                <w:kern w:val="2"/>
+                <w:lang w:val="en-US"/>
+                <w14:ligatures w14:val="standardContextual"/>
+              </w:rPr>
+              <w:t>AppEligibility</w:t>
+            </w:r>
+            <w:proofErr w:type="spellEnd"/>
+            <w:r>
+              <w:rPr>
+                <w:rFonts w:ascii="Bookman Old Style" w:hAnsi="Bookman Old Style"/>
+                <w:kern w:val="2"/>
+                <w:lang w:val="en-US"/>
+                <w14:ligatures w14:val="standardContextual"/>
+              </w:rPr>
+              <w:t>}</w:t>
             </w:r>
           </w:p>
         </w:tc>
         <w:tc>
           <w:tcPr>
-            <w:tcW w:w="1440" w:type="dxa"/>
+            <w:tcW w:w="1889" w:type="dxa"/>
             <w:tcBorders>
               <w:top w:val="single" w:sz="4" w:space="0" w:color="auto"/>
               <w:left w:val="single" w:sz="4" w:space="0" w:color="auto"/>
@@ -909,8 +1189,31 @@
             <w:r>
               <w:rPr>
                 <w:rFonts w:ascii="Bookman Old Style" w:hAnsi="Bookman Old Style"/>
-              </w:rPr>
-              <w:t>{RmEligibility}</w:t>
+                <w:kern w:val="2"/>
+                <w:lang w:val="en-US"/>
+                <w14:ligatures w14:val="standardContextual"/>
+              </w:rPr>
+              <w:t>{</w:t>
+            </w:r>
+            <w:proofErr w:type="spellStart"/>
+            <w:r>
+              <w:rPr>
+                <w:rFonts w:ascii="Bookman Old Style" w:hAnsi="Bookman Old Style"/>
+                <w:kern w:val="2"/>
+                <w:lang w:val="en-US"/>
+                <w14:ligatures w14:val="standardContextual"/>
+              </w:rPr>
+              <w:t>RmEligibility</w:t>
+            </w:r>
+            <w:proofErr w:type="spellEnd"/>
+            <w:r>
+              <w:rPr>
+                <w:rFonts w:ascii="Bookman Old Style" w:hAnsi="Bookman Old Style"/>
+                <w:kern w:val="2"/>
+                <w:lang w:val="en-US"/>
+                <w14:ligatures w14:val="standardContextual"/>
+              </w:rPr>
+              <w:t>}</w:t>
             </w:r>
           </w:p>
         </w:tc>
@@ -918,7 +1221,7 @@
       <w:tr>
         <w:tc>
           <w:tcPr>
-            <w:tcW w:w="1885" w:type="dxa"/>
+            <w:tcW w:w="1811" w:type="dxa"/>
             <w:vMerge/>
             <w:tcBorders>
               <w:left w:val="single" w:sz="4" w:space="0" w:color="auto"/>
@@ -937,7 +1240,7 @@
         </w:tc>
         <w:tc>
           <w:tcPr>
-            <w:tcW w:w="3600" w:type="dxa"/>
+            <w:tcW w:w="3904" w:type="dxa"/>
             <w:tcBorders>
               <w:top w:val="single" w:sz="4" w:space="0" w:color="auto"/>
               <w:left w:val="single" w:sz="4" w:space="0" w:color="auto"/>
@@ -971,7 +1274,7 @@
         </w:tc>
         <w:tc>
           <w:tcPr>
-            <w:tcW w:w="3515" w:type="dxa"/>
+            <w:tcW w:w="2836" w:type="dxa"/>
             <w:tcBorders>
               <w:top w:val="single" w:sz="4" w:space="0" w:color="auto"/>
               <w:left w:val="single" w:sz="4" w:space="0" w:color="auto"/>
@@ -1000,7 +1303,7 @@
         </w:tc>
         <w:tc>
           <w:tcPr>
-            <w:tcW w:w="1440" w:type="dxa"/>
+            <w:tcW w:w="1889" w:type="dxa"/>
             <w:tcBorders>
               <w:top w:val="single" w:sz="4" w:space="0" w:color="auto"/>
               <w:left w:val="single" w:sz="4" w:space="0" w:color="auto"/>
@@ -1034,7 +1337,7 @@
         </w:trPr>
         <w:tc>
           <w:tcPr>
-            <w:tcW w:w="1885" w:type="dxa"/>
+            <w:tcW w:w="1811" w:type="dxa"/>
             <w:vMerge/>
             <w:tcBorders>
               <w:left w:val="single" w:sz="4" w:space="0" w:color="auto"/>
@@ -1053,7 +1356,7 @@
         </w:tc>
         <w:tc>
           <w:tcPr>
-            <w:tcW w:w="3600" w:type="dxa"/>
+            <w:tcW w:w="3904" w:type="dxa"/>
             <w:vMerge w:val="restart"/>
             <w:tcBorders>
               <w:top w:val="single" w:sz="4" w:space="0" w:color="auto"/>
@@ -1103,7 +1406,7 @@
         </w:tc>
         <w:tc>
           <w:tcPr>
-            <w:tcW w:w="3515" w:type="dxa"/>
+            <w:tcW w:w="2836" w:type="dxa"/>
             <w:tcBorders>
               <w:top w:val="single" w:sz="4" w:space="0" w:color="auto"/>
               <w:left w:val="single" w:sz="4" w:space="0" w:color="auto"/>
@@ -1129,7 +1432,7 @@
         </w:tc>
         <w:tc>
           <w:tcPr>
-            <w:tcW w:w="1440" w:type="dxa"/>
+            <w:tcW w:w="1889" w:type="dxa"/>
             <w:vMerge w:val="restart"/>
             <w:tcBorders>
               <w:top w:val="single" w:sz="4" w:space="0" w:color="auto"/>
@@ -1161,7 +1464,7 @@
         </w:trPr>
         <w:tc>
           <w:tcPr>
-            <w:tcW w:w="1885" w:type="dxa"/>
+            <w:tcW w:w="1811" w:type="dxa"/>
             <w:vMerge/>
             <w:tcBorders>
               <w:left w:val="single" w:sz="4" w:space="0" w:color="auto"/>
@@ -1180,7 +1483,7 @@
         </w:tc>
         <w:tc>
           <w:tcPr>
-            <w:tcW w:w="3600" w:type="dxa"/>
+            <w:tcW w:w="3904" w:type="dxa"/>
             <w:vMerge/>
             <w:tcBorders>
               <w:left w:val="single" w:sz="4" w:space="0" w:color="auto"/>
@@ -1202,7 +1505,7 @@
         </w:tc>
         <w:tc>
           <w:tcPr>
-            <w:tcW w:w="3515" w:type="dxa"/>
+            <w:tcW w:w="2836" w:type="dxa"/>
             <w:tcBorders>
               <w:top w:val="single" w:sz="4" w:space="0" w:color="auto"/>
               <w:left w:val="single" w:sz="4" w:space="0" w:color="auto"/>
@@ -1228,7 +1531,7 @@
         </w:tc>
         <w:tc>
           <w:tcPr>
-            <w:tcW w:w="1440" w:type="dxa"/>
+            <w:tcW w:w="1889" w:type="dxa"/>
             <w:vMerge/>
             <w:tcBorders>
               <w:left w:val="single" w:sz="4" w:space="0" w:color="auto"/>
@@ -1250,7 +1553,7 @@
       <w:tr>
         <w:tc>
           <w:tcPr>
-            <w:tcW w:w="1885" w:type="dxa"/>
+            <w:tcW w:w="1811" w:type="dxa"/>
             <w:vMerge/>
             <w:tcBorders>
               <w:left w:val="single" w:sz="4" w:space="0" w:color="auto"/>
@@ -1270,7 +1573,7 @@
         </w:tc>
         <w:tc>
           <w:tcPr>
-            <w:tcW w:w="3600" w:type="dxa"/>
+            <w:tcW w:w="3904" w:type="dxa"/>
             <w:vMerge/>
             <w:tcBorders>
               <w:left w:val="single" w:sz="4" w:space="0" w:color="auto"/>
@@ -1293,7 +1596,7 @@
         </w:tc>
         <w:tc>
           <w:tcPr>
-            <w:tcW w:w="3515" w:type="dxa"/>
+            <w:tcW w:w="2836" w:type="dxa"/>
             <w:tcBorders>
               <w:top w:val="single" w:sz="4" w:space="0" w:color="auto"/>
               <w:left w:val="single" w:sz="4" w:space="0" w:color="auto"/>
@@ -1319,7 +1622,7 @@
         </w:tc>
         <w:tc>
           <w:tcPr>
-            <w:tcW w:w="1440" w:type="dxa"/>
+            <w:tcW w:w="1889" w:type="dxa"/>
             <w:vMerge/>
             <w:tcBorders>
               <w:left w:val="single" w:sz="4" w:space="0" w:color="auto"/>
@@ -1450,7 +1753,25 @@
           <w:b/>
           <w:bCs/>
         </w:rPr>
-        <w:t>T3(SST1)-DOP-001</w:t>
+        <w:t>{</w:t>
+      </w:r>
+      <w:proofErr w:type="spellStart"/>
+      <w:r>
+        <w:rPr>
+          <w:rFonts w:ascii="Bookman Old Style" w:hAnsi="Bookman Old Style"/>
+          <w:b/>
+          <w:bCs/>
+        </w:rPr>
+        <w:t>ApplicationCode</w:t>
+      </w:r>
+      <w:proofErr w:type="spellEnd"/>
+      <w:r>
+        <w:rPr>
+          <w:rFonts w:ascii="Bookman Old Style" w:hAnsi="Bookman Old Style"/>
+          <w:b/>
+          <w:bCs/>
+        </w:rPr>
+        <w:t>}</w:t>
       </w:r>
       <w:r>
         <w:rPr>
@@ -2536,11 +2857,7 @@
         </mc:Choice>
         <mc:Fallback>
           <w:pict>
-            <v:shapetype w14:anchorId="098F1ADA" id="_x0000_t202" coordsize="21600,21600" o:spt="202" path="m,l,21600r21600,l21600,xe">
-              <v:stroke joinstyle="miter"/>
-              <v:path gradientshapeok="t" o:connecttype="rect"/>
-            </v:shapetype>
-            <v:shape id="Text Box 3" o:spid="_x0000_s1027" type="#_x0000_t202" style="position:absolute;margin-left:247.2pt;margin-top:21.45pt;width:166.4pt;height:23.6pt;z-index:251665408;visibility:visible;mso-wrap-style:square;mso-width-percent:0;mso-height-percent:0;mso-wrap-distance-left:9pt;mso-wrap-distance-top:0;mso-wrap-distance-right:9pt;mso-wrap-distance-bottom:0;mso-position-horizontal:absolute;mso-position-horizontal-relative:text;mso-position-vertical:absolute;mso-position-vertical-relative:text;mso-width-percent:0;mso-height-percent:0;mso-width-relative:page;mso-height-relative:page;v-text-anchor:top" o:gfxdata="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" stroked="f">
+            <v:shape w14:anchorId="098F1ADA" id="Text Box 3" o:spid="_x0000_s1027" type="#_x0000_t202" style="position:absolute;margin-left:247.2pt;margin-top:21.45pt;width:166.4pt;height:23.6pt;z-index:251665408;visibility:visible;mso-wrap-style:square;mso-width-percent:0;mso-height-percent:0;mso-wrap-distance-left:9pt;mso-wrap-distance-top:0;mso-wrap-distance-right:9pt;mso-wrap-distance-bottom:0;mso-position-horizontal:absolute;mso-position-horizontal-relative:text;mso-position-vertical:absolute;mso-position-vertical-relative:text;mso-width-percent:0;mso-height-percent:0;mso-width-relative:page;mso-height-relative:page;v-text-anchor:top" o:gfxdata="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" stroked="f">
               <v:textbox inset="1.44pt,0,0,0">
                 <w:txbxContent>
                   <w:tbl>

</xml_diff>

<commit_message>
fix: update disqualification reason in seeders and fix document fallback bug
</commit_message>
<xml_diff>
--- a/rsp-dashboard/public/templates/Notice to DQ - Higher Teaching.docx
+++ b/rsp-dashboard/public/templates/Notice to DQ - Higher Teaching.docx
@@ -23,21 +23,7 @@
         <w:rPr>
           <w:rFonts w:ascii="Bookman Old Style" w:hAnsi="Bookman Old Style"/>
         </w:rPr>
-        <w:t>{</w:t>
-      </w:r>
-      <w:proofErr w:type="spellStart"/>
-      <w:r>
-        <w:rPr>
-          <w:rFonts w:ascii="Bookman Old Style" w:hAnsi="Bookman Old Style"/>
-        </w:rPr>
-        <w:t>FormattedDate</w:t>
-      </w:r>
-      <w:proofErr w:type="spellEnd"/>
-      <w:r>
-        <w:rPr>
-          <w:rFonts w:ascii="Bookman Old Style" w:hAnsi="Bookman Old Style"/>
-        </w:rPr>
-        <w:t>}</w:t>
+        <w:t>{FormattedDate}</w:t>
       </w:r>
     </w:p>
     <w:p>
@@ -63,25 +49,7 @@
           <w:b/>
           <w:bCs/>
         </w:rPr>
-        <w:t>{</w:t>
-      </w:r>
-      <w:proofErr w:type="spellStart"/>
-      <w:r>
-        <w:rPr>
-          <w:rFonts w:ascii="Bookman Old Style" w:hAnsi="Bookman Old Style"/>
-          <w:b/>
-          <w:bCs/>
-        </w:rPr>
-        <w:t>ApplicantName</w:t>
-      </w:r>
-      <w:proofErr w:type="spellEnd"/>
-      <w:r>
-        <w:rPr>
-          <w:rFonts w:ascii="Bookman Old Style" w:hAnsi="Bookman Old Style"/>
-          <w:b/>
-          <w:bCs/>
-        </w:rPr>
-        <w:t>}</w:t>
+        <w:t>{ApplicantName}</w:t>
       </w:r>
     </w:p>
     <w:p>
@@ -426,7 +394,6 @@
               </w:rPr>
               <w:t>Education:</w:t>
             </w:r>
-            <w:proofErr w:type="gramStart"/>
             <w:r>
               <w:rPr>
                 <w:rFonts w:ascii="Bookman Old Style" w:hAnsi="Bookman Old Style"/>
@@ -464,32 +431,7 @@
                 <w:lang w:val="en-US"/>
                 <w14:ligatures w14:val="standardContextual"/>
               </w:rPr>
-              <w:t>{</w:t>
-            </w:r>
-            <w:proofErr w:type="spellStart"/>
-            <w:proofErr w:type="gramEnd"/>
-            <w:r>
-              <w:rPr>
-                <w:rFonts w:ascii="Bookman Old Style" w:hAnsi="Bookman Old Style"/>
-                <w:bCs/>
-                <w:color w:val="EE0000"/>
-                <w:kern w:val="2"/>
-                <w:lang w:val="en-US"/>
-                <w14:ligatures w14:val="standardContextual"/>
-              </w:rPr>
-              <w:t>QSEducation</w:t>
-            </w:r>
-            <w:proofErr w:type="spellEnd"/>
-            <w:r>
-              <w:rPr>
-                <w:rFonts w:ascii="Bookman Old Style" w:hAnsi="Bookman Old Style"/>
-                <w:bCs/>
-                <w:color w:val="EE0000"/>
-                <w:kern w:val="2"/>
-                <w:lang w:val="en-US"/>
-                <w14:ligatures w14:val="standardContextual"/>
-              </w:rPr>
-              <w:t>}</w:t>
+              <w:t>{QSEducation}</w:t>
             </w:r>
           </w:p>
         </w:tc>
@@ -518,27 +460,7 @@
                 <w:lang w:val="en-US"/>
                 <w14:ligatures w14:val="standardContextual"/>
               </w:rPr>
-              <w:t>{</w:t>
-            </w:r>
-            <w:proofErr w:type="spellStart"/>
-            <w:r>
-              <w:rPr>
-                <w:rFonts w:ascii="Bookman Old Style" w:hAnsi="Bookman Old Style"/>
-                <w:kern w:val="2"/>
-                <w:lang w:val="en-US"/>
-                <w14:ligatures w14:val="standardContextual"/>
-              </w:rPr>
-              <w:t>AppEducation</w:t>
-            </w:r>
-            <w:proofErr w:type="spellEnd"/>
-            <w:r>
-              <w:rPr>
-                <w:rFonts w:ascii="Bookman Old Style" w:hAnsi="Bookman Old Style"/>
-                <w:kern w:val="2"/>
-                <w:lang w:val="en-US"/>
-                <w14:ligatures w14:val="standardContextual"/>
-              </w:rPr>
-              <w:t>}</w:t>
+              <w:t>{AppEducation}</w:t>
             </w:r>
           </w:p>
         </w:tc>
@@ -568,27 +490,7 @@
                 <w:lang w:val="en-US"/>
                 <w14:ligatures w14:val="standardContextual"/>
               </w:rPr>
-              <w:t>{</w:t>
-            </w:r>
-            <w:proofErr w:type="spellStart"/>
-            <w:r>
-              <w:rPr>
-                <w:rFonts w:ascii="Bookman Old Style" w:hAnsi="Bookman Old Style"/>
-                <w:kern w:val="2"/>
-                <w:lang w:val="en-US"/>
-                <w14:ligatures w14:val="standardContextual"/>
-              </w:rPr>
-              <w:t>RmEducation</w:t>
-            </w:r>
-            <w:proofErr w:type="spellEnd"/>
-            <w:r>
-              <w:rPr>
-                <w:rFonts w:ascii="Bookman Old Style" w:hAnsi="Bookman Old Style"/>
-                <w:kern w:val="2"/>
-                <w:lang w:val="en-US"/>
-                <w14:ligatures w14:val="standardContextual"/>
-              </w:rPr>
-              <w:t>}</w:t>
+              <w:t>{RmEducation}</w:t>
             </w:r>
           </w:p>
         </w:tc>
@@ -641,18 +543,7 @@
                 <w:lang w:val="en-US"/>
                 <w14:ligatures w14:val="standardContextual"/>
               </w:rPr>
-              <w:t>Training</w:t>
-            </w:r>
-            <w:proofErr w:type="gramStart"/>
-            <w:r>
-              <w:rPr>
-                <w:rFonts w:ascii="Bookman Old Style" w:hAnsi="Bookman Old Style"/>
-                <w:b/>
-                <w:kern w:val="2"/>
-                <w:lang w:val="en-US"/>
-                <w14:ligatures w14:val="standardContextual"/>
-              </w:rPr>
-              <w:t xml:space="preserve">: </w:t>
+              <w:t xml:space="preserve">Training: </w:t>
             </w:r>
             <w:r>
               <w:rPr>
@@ -672,32 +563,7 @@
                 <w:lang w:val="en-US"/>
                 <w14:ligatures w14:val="standardContextual"/>
               </w:rPr>
-              <w:t>{</w:t>
-            </w:r>
-            <w:proofErr w:type="spellStart"/>
-            <w:proofErr w:type="gramEnd"/>
-            <w:r>
-              <w:rPr>
-                <w:rFonts w:ascii="Bookman Old Style" w:hAnsi="Bookman Old Style"/>
-                <w:bCs/>
-                <w:color w:val="EE0000"/>
-                <w:kern w:val="2"/>
-                <w:lang w:val="en-US"/>
-                <w14:ligatures w14:val="standardContextual"/>
-              </w:rPr>
-              <w:t>QSTraining</w:t>
-            </w:r>
-            <w:proofErr w:type="spellEnd"/>
-            <w:r>
-              <w:rPr>
-                <w:rFonts w:ascii="Bookman Old Style" w:hAnsi="Bookman Old Style"/>
-                <w:bCs/>
-                <w:color w:val="EE0000"/>
-                <w:kern w:val="2"/>
-                <w:lang w:val="en-US"/>
-                <w14:ligatures w14:val="standardContextual"/>
-              </w:rPr>
-              <w:t>}</w:t>
+              <w:t>{QSTraining}</w:t>
             </w:r>
           </w:p>
         </w:tc>
@@ -726,27 +592,7 @@
                 <w:lang w:val="en-US"/>
                 <w14:ligatures w14:val="standardContextual"/>
               </w:rPr>
-              <w:t>{</w:t>
-            </w:r>
-            <w:proofErr w:type="spellStart"/>
-            <w:r>
-              <w:rPr>
-                <w:rFonts w:ascii="Bookman Old Style" w:hAnsi="Bookman Old Style"/>
-                <w:kern w:val="2"/>
-                <w:lang w:val="en-US"/>
-                <w14:ligatures w14:val="standardContextual"/>
-              </w:rPr>
-              <w:t>AppTraining</w:t>
-            </w:r>
-            <w:proofErr w:type="spellEnd"/>
-            <w:r>
-              <w:rPr>
-                <w:rFonts w:ascii="Bookman Old Style" w:hAnsi="Bookman Old Style"/>
-                <w:kern w:val="2"/>
-                <w:lang w:val="en-US"/>
-                <w14:ligatures w14:val="standardContextual"/>
-              </w:rPr>
-              <w:t>}</w:t>
+              <w:t>{AppTraining}</w:t>
             </w:r>
           </w:p>
         </w:tc>
@@ -777,27 +623,7 @@
                 <w:lang w:val="en-US"/>
                 <w14:ligatures w14:val="standardContextual"/>
               </w:rPr>
-              <w:t>{</w:t>
-            </w:r>
-            <w:proofErr w:type="spellStart"/>
-            <w:r>
-              <w:rPr>
-                <w:rFonts w:ascii="Bookman Old Style" w:hAnsi="Bookman Old Style"/>
-                <w:kern w:val="2"/>
-                <w:lang w:val="en-US"/>
-                <w14:ligatures w14:val="standardContextual"/>
-              </w:rPr>
-              <w:t>RmExperience</w:t>
-            </w:r>
-            <w:proofErr w:type="spellEnd"/>
-            <w:r>
-              <w:rPr>
-                <w:rFonts w:ascii="Bookman Old Style" w:hAnsi="Bookman Old Style"/>
-                <w:kern w:val="2"/>
-                <w:lang w:val="en-US"/>
-                <w14:ligatures w14:val="standardContextual"/>
-              </w:rPr>
-              <w:t>}</w:t>
+              <w:t>{RmExperience}</w:t>
             </w:r>
           </w:p>
         </w:tc>
@@ -850,18 +676,7 @@
                 <w:lang w:val="en-US"/>
                 <w14:ligatures w14:val="standardContextual"/>
               </w:rPr>
-              <w:t>Experience</w:t>
-            </w:r>
-            <w:proofErr w:type="gramStart"/>
-            <w:r>
-              <w:rPr>
-                <w:rFonts w:ascii="Bookman Old Style" w:hAnsi="Bookman Old Style"/>
-                <w:b/>
-                <w:kern w:val="2"/>
-                <w:lang w:val="en-US"/>
-                <w14:ligatures w14:val="standardContextual"/>
-              </w:rPr>
-              <w:t xml:space="preserve">: </w:t>
+              <w:t xml:space="preserve">Experience: </w:t>
             </w:r>
             <w:r>
               <w:rPr>
@@ -881,32 +696,7 @@
                 <w:lang w:val="en-US"/>
                 <w14:ligatures w14:val="standardContextual"/>
               </w:rPr>
-              <w:t>{</w:t>
-            </w:r>
-            <w:proofErr w:type="spellStart"/>
-            <w:proofErr w:type="gramEnd"/>
-            <w:r>
-              <w:rPr>
-                <w:rFonts w:ascii="Bookman Old Style" w:hAnsi="Bookman Old Style"/>
-                <w:bCs/>
-                <w:color w:val="EE0000"/>
-                <w:kern w:val="2"/>
-                <w:lang w:val="en-US"/>
-                <w14:ligatures w14:val="standardContextual"/>
-              </w:rPr>
-              <w:t>QSExperience</w:t>
-            </w:r>
-            <w:proofErr w:type="spellEnd"/>
-            <w:r>
-              <w:rPr>
-                <w:rFonts w:ascii="Bookman Old Style" w:hAnsi="Bookman Old Style"/>
-                <w:bCs/>
-                <w:color w:val="EE0000"/>
-                <w:kern w:val="2"/>
-                <w:lang w:val="en-US"/>
-                <w14:ligatures w14:val="standardContextual"/>
-              </w:rPr>
-              <w:t>}</w:t>
+              <w:t>{QSExperience}</w:t>
             </w:r>
           </w:p>
         </w:tc>
@@ -935,27 +725,7 @@
                 <w:lang w:val="en-US"/>
                 <w14:ligatures w14:val="standardContextual"/>
               </w:rPr>
-              <w:t>{</w:t>
-            </w:r>
-            <w:proofErr w:type="spellStart"/>
-            <w:r>
-              <w:rPr>
-                <w:rFonts w:ascii="Bookman Old Style" w:hAnsi="Bookman Old Style"/>
-                <w:kern w:val="2"/>
-                <w:lang w:val="en-US"/>
-                <w14:ligatures w14:val="standardContextual"/>
-              </w:rPr>
-              <w:t>AppExperience</w:t>
-            </w:r>
-            <w:proofErr w:type="spellEnd"/>
-            <w:r>
-              <w:rPr>
-                <w:rFonts w:ascii="Bookman Old Style" w:hAnsi="Bookman Old Style"/>
-                <w:kern w:val="2"/>
-                <w:lang w:val="en-US"/>
-                <w14:ligatures w14:val="standardContextual"/>
-              </w:rPr>
-              <w:t>}</w:t>
+              <w:t>{AppExperience}</w:t>
             </w:r>
           </w:p>
         </w:tc>
@@ -985,27 +755,7 @@
                 <w:lang w:val="en-US"/>
                 <w14:ligatures w14:val="standardContextual"/>
               </w:rPr>
-              <w:t>{</w:t>
-            </w:r>
-            <w:proofErr w:type="spellStart"/>
-            <w:r>
-              <w:rPr>
-                <w:rFonts w:ascii="Bookman Old Style" w:hAnsi="Bookman Old Style"/>
-                <w:kern w:val="2"/>
-                <w:lang w:val="en-US"/>
-                <w14:ligatures w14:val="standardContextual"/>
-              </w:rPr>
-              <w:t>RmTraining</w:t>
-            </w:r>
-            <w:proofErr w:type="spellEnd"/>
-            <w:r>
-              <w:rPr>
-                <w:rFonts w:ascii="Bookman Old Style" w:hAnsi="Bookman Old Style"/>
-                <w:kern w:val="2"/>
-                <w:lang w:val="en-US"/>
-                <w14:ligatures w14:val="standardContextual"/>
-              </w:rPr>
-              <w:t>}</w:t>
+              <w:t>{RmTraining}</w:t>
             </w:r>
           </w:p>
         </w:tc>
@@ -1058,18 +808,7 @@
                 <w:lang w:val="en-US"/>
                 <w14:ligatures w14:val="standardContextual"/>
               </w:rPr>
-              <w:t>Eligibility</w:t>
-            </w:r>
-            <w:proofErr w:type="gramStart"/>
-            <w:r>
-              <w:rPr>
-                <w:rFonts w:ascii="Bookman Old Style" w:hAnsi="Bookman Old Style"/>
-                <w:b/>
-                <w:kern w:val="2"/>
-                <w:lang w:val="en-US"/>
-                <w14:ligatures w14:val="standardContextual"/>
-              </w:rPr>
-              <w:t>:</w:t>
+              <w:t>Eligibility:</w:t>
             </w:r>
             <w:r>
               <w:rPr>
@@ -1089,32 +828,7 @@
                 <w:lang w:val="en-US"/>
                 <w14:ligatures w14:val="standardContextual"/>
               </w:rPr>
-              <w:t>{</w:t>
-            </w:r>
-            <w:proofErr w:type="spellStart"/>
-            <w:proofErr w:type="gramEnd"/>
-            <w:r>
-              <w:rPr>
-                <w:rFonts w:ascii="Bookman Old Style" w:hAnsi="Bookman Old Style"/>
-                <w:bCs/>
-                <w:color w:val="EE0000"/>
-                <w:kern w:val="2"/>
-                <w:lang w:val="en-US"/>
-                <w14:ligatures w14:val="standardContextual"/>
-              </w:rPr>
-              <w:t>QSEligibility</w:t>
-            </w:r>
-            <w:proofErr w:type="spellEnd"/>
-            <w:r>
-              <w:rPr>
-                <w:rFonts w:ascii="Bookman Old Style" w:hAnsi="Bookman Old Style"/>
-                <w:bCs/>
-                <w:color w:val="EE0000"/>
-                <w:kern w:val="2"/>
-                <w:lang w:val="en-US"/>
-                <w14:ligatures w14:val="standardContextual"/>
-              </w:rPr>
-              <w:t>}</w:t>
+              <w:t>{QSEligibility}</w:t>
             </w:r>
           </w:p>
         </w:tc>
@@ -1143,27 +857,7 @@
                 <w:lang w:val="en-US"/>
                 <w14:ligatures w14:val="standardContextual"/>
               </w:rPr>
-              <w:t>{</w:t>
-            </w:r>
-            <w:proofErr w:type="spellStart"/>
-            <w:r>
-              <w:rPr>
-                <w:rFonts w:ascii="Bookman Old Style" w:hAnsi="Bookman Old Style"/>
-                <w:kern w:val="2"/>
-                <w:lang w:val="en-US"/>
-                <w14:ligatures w14:val="standardContextual"/>
-              </w:rPr>
-              <w:t>AppEligibility</w:t>
-            </w:r>
-            <w:proofErr w:type="spellEnd"/>
-            <w:r>
-              <w:rPr>
-                <w:rFonts w:ascii="Bookman Old Style" w:hAnsi="Bookman Old Style"/>
-                <w:kern w:val="2"/>
-                <w:lang w:val="en-US"/>
-                <w14:ligatures w14:val="standardContextual"/>
-              </w:rPr>
-              <w:t>}</w:t>
+              <w:t>{AppEligibility}</w:t>
             </w:r>
           </w:p>
         </w:tc>
@@ -1193,27 +887,7 @@
                 <w:lang w:val="en-US"/>
                 <w14:ligatures w14:val="standardContextual"/>
               </w:rPr>
-              <w:t>{</w:t>
-            </w:r>
-            <w:proofErr w:type="spellStart"/>
-            <w:r>
-              <w:rPr>
-                <w:rFonts w:ascii="Bookman Old Style" w:hAnsi="Bookman Old Style"/>
-                <w:kern w:val="2"/>
-                <w:lang w:val="en-US"/>
-                <w14:ligatures w14:val="standardContextual"/>
-              </w:rPr>
-              <w:t>RmEligibility</w:t>
-            </w:r>
-            <w:proofErr w:type="spellEnd"/>
-            <w:r>
-              <w:rPr>
-                <w:rFonts w:ascii="Bookman Old Style" w:hAnsi="Bookman Old Style"/>
-                <w:kern w:val="2"/>
-                <w:lang w:val="en-US"/>
-                <w14:ligatures w14:val="standardContextual"/>
-              </w:rPr>
-              <w:t>}</w:t>
+              <w:t>{RmEligibility}</w:t>
             </w:r>
           </w:p>
         </w:tc>
@@ -1671,21 +1345,19 @@
         <w:rPr>
           <w:rFonts w:ascii="Bookman Old Style" w:hAnsi="Bookman Old Style"/>
         </w:rPr>
-        <w:t xml:space="preserve">While your qualifications made a favorable impression, we regret to inform you that you did not meet the minimum QS set for </w:t>
+        <w:t>{ReasonText}</w:t>
       </w:r>
       <w:r>
         <w:rPr>
           <w:rFonts w:ascii="Bookman Old Style" w:hAnsi="Bookman Old Style"/>
-          <w:b/>
-          <w:bCs/>
-        </w:rPr>
-        <w:t>{Position}</w:t>
+        </w:rPr>
+        <w:t xml:space="preserve"> </w:t>
       </w:r>
       <w:r>
         <w:rPr>
           <w:rFonts w:ascii="Bookman Old Style" w:hAnsi="Bookman Old Style"/>
         </w:rPr>
-        <w:t xml:space="preserve"> position. You may, however, continue to submit job applications in response to other vacancy announcements that we publish at </w:t>
+        <w:t xml:space="preserve">You may, however, continue to submit job applications in response to other vacancy announcements that we publish at </w:t>
       </w:r>
       <w:hyperlink r:id="rId7" w:history="1">
         <w:r>
@@ -1753,25 +1425,7 @@
           <w:b/>
           <w:bCs/>
         </w:rPr>
-        <w:t>{</w:t>
-      </w:r>
-      <w:proofErr w:type="spellStart"/>
-      <w:r>
-        <w:rPr>
-          <w:rFonts w:ascii="Bookman Old Style" w:hAnsi="Bookman Old Style"/>
-          <w:b/>
-          <w:bCs/>
-        </w:rPr>
-        <w:t>ApplicationCode</w:t>
-      </w:r>
-      <w:proofErr w:type="spellEnd"/>
-      <w:r>
-        <w:rPr>
-          <w:rFonts w:ascii="Bookman Old Style" w:hAnsi="Bookman Old Style"/>
-          <w:b/>
-          <w:bCs/>
-        </w:rPr>
-        <w:t>}</w:t>
+        <w:t>{ApplicationCode}</w:t>
       </w:r>
       <w:r>
         <w:rPr>
@@ -2857,7 +2511,11 @@
         </mc:Choice>
         <mc:Fallback>
           <w:pict>
-            <v:shape w14:anchorId="098F1ADA" id="Text Box 3" o:spid="_x0000_s1027" type="#_x0000_t202" style="position:absolute;margin-left:247.2pt;margin-top:21.45pt;width:166.4pt;height:23.6pt;z-index:251665408;visibility:visible;mso-wrap-style:square;mso-width-percent:0;mso-height-percent:0;mso-wrap-distance-left:9pt;mso-wrap-distance-top:0;mso-wrap-distance-right:9pt;mso-wrap-distance-bottom:0;mso-position-horizontal:absolute;mso-position-horizontal-relative:text;mso-position-vertical:absolute;mso-position-vertical-relative:text;mso-width-percent:0;mso-height-percent:0;mso-width-relative:page;mso-height-relative:page;v-text-anchor:top" o:gfxdata="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" stroked="f">
+            <v:shapetype w14:anchorId="098F1ADA" id="_x0000_t202" coordsize="21600,21600" o:spt="202" path="m,l,21600r21600,l21600,xe">
+              <v:stroke joinstyle="miter"/>
+              <v:path gradientshapeok="t" o:connecttype="rect"/>
+            </v:shapetype>
+            <v:shape id="Text Box 3" o:spid="_x0000_s1027" type="#_x0000_t202" style="position:absolute;margin-left:247.2pt;margin-top:21.45pt;width:166.4pt;height:23.6pt;z-index:251665408;visibility:visible;mso-wrap-style:square;mso-width-percent:0;mso-height-percent:0;mso-wrap-distance-left:9pt;mso-wrap-distance-top:0;mso-wrap-distance-right:9pt;mso-wrap-distance-bottom:0;mso-position-horizontal:absolute;mso-position-horizontal-relative:text;mso-position-vertical:absolute;mso-position-vertical-relative:text;mso-width-percent:0;mso-height-percent:0;mso-width-relative:page;mso-height-relative:page;v-text-anchor:top" o:gfxdata="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" stroked="f">
               <v:textbox inset="1.44pt,0,0,0">
                 <w:txbxContent>
                   <w:tbl>

</xml_diff>